<commit_message>
refactor: clean presentation, pure form replicas, interactive tabs and remove rubric tables
</commit_message>
<xml_diff>
--- a/Assignment4_Beisenbay_Estai.docx
+++ b/Assignment4_Beisenbay_Estai.docx
@@ -195,14 +195,14 @@
       <w:pPr>
         <w:spacing w:after="100" w:line="270" w:lineRule="auto"/>
         <w:rPr>
-          <w:rFonts w:ascii="Calibri" w:hAnsi="Calibri"/>
+          <w:rFonts w:ascii="Calibri" w:hAnsi="Calibri" w:cs="Calibri"/>
           <w:color w:val="000000"/>
           <w:sz w:val="22"/>
         </w:rPr>
       </w:pPr>
       <w:r>
         <w:rPr>
-          <w:rFonts w:ascii="Calibri" w:hAnsi="Calibri"/>
+          <w:rFonts w:ascii="Calibri" w:hAnsi="Calibri" w:cs="Calibri"/>
           <w:color w:val="000000"/>
           <w:sz w:val="22"/>
         </w:rPr>
@@ -213,14 +213,14 @@
       <w:pPr>
         <w:spacing w:after="100" w:line="270" w:lineRule="auto"/>
         <w:rPr>
-          <w:rFonts w:ascii="Calibri" w:hAnsi="Calibri"/>
+          <w:rFonts w:ascii="Calibri" w:hAnsi="Calibri" w:cs="Calibri"/>
           <w:color w:val="000000"/>
           <w:sz w:val="22"/>
         </w:rPr>
       </w:pPr>
       <w:r>
         <w:rPr>
-          <w:rFonts w:ascii="Calibri" w:hAnsi="Calibri"/>
+          <w:rFonts w:ascii="Calibri" w:hAnsi="Calibri" w:cs="Calibri"/>
           <w:color w:val="000000"/>
           <w:sz w:val="22"/>
         </w:rPr>
@@ -231,14 +231,14 @@
       <w:pPr>
         <w:spacing w:after="100" w:line="270" w:lineRule="auto"/>
         <w:rPr>
-          <w:rFonts w:ascii="Calibri" w:hAnsi="Calibri"/>
+          <w:rFonts w:ascii="Calibri" w:hAnsi="Calibri" w:cs="Calibri"/>
           <w:color w:val="000000"/>
           <w:sz w:val="22"/>
         </w:rPr>
       </w:pPr>
       <w:r>
         <w:rPr>
-          <w:rFonts w:ascii="Calibri" w:hAnsi="Calibri"/>
+          <w:rFonts w:ascii="Calibri" w:hAnsi="Calibri" w:cs="Calibri"/>
           <w:color w:val="000000"/>
           <w:sz w:val="22"/>
         </w:rPr>
@@ -249,14 +249,14 @@
       <w:pPr>
         <w:spacing w:after="100" w:line="270" w:lineRule="auto"/>
         <w:rPr>
-          <w:rFonts w:ascii="Calibri" w:hAnsi="Calibri"/>
+          <w:rFonts w:ascii="Calibri" w:hAnsi="Calibri" w:cs="Calibri"/>
           <w:color w:val="000000"/>
           <w:sz w:val="22"/>
         </w:rPr>
       </w:pPr>
       <w:r>
         <w:rPr>
-          <w:rFonts w:ascii="Calibri" w:hAnsi="Calibri"/>
+          <w:rFonts w:ascii="Calibri" w:hAnsi="Calibri" w:cs="Calibri"/>
           <w:color w:val="000000"/>
           <w:sz w:val="22"/>
         </w:rPr>
@@ -267,7 +267,7 @@
       <w:pPr>
         <w:spacing w:before="280" w:after="120" w:line="270" w:lineRule="auto"/>
         <w:rPr>
-          <w:rFonts w:ascii="Montserrat" w:hAnsi="Montserrat"/>
+          <w:rFonts w:ascii="Montserrat" w:hAnsi="Montserrat" w:cs="Calibri"/>
           <w:b/>
           <w:color w:val="0F6B5F"/>
           <w:sz w:val="34"/>
@@ -275,7 +275,7 @@
       </w:pPr>
       <w:r>
         <w:rPr>
-          <w:rFonts w:ascii="Montserrat" w:hAnsi="Montserrat"/>
+          <w:rFonts w:ascii="Montserrat" w:hAnsi="Montserrat" w:cs="Calibri"/>
           <w:b/>
           <w:color w:val="0F6B5F"/>
           <w:sz w:val="34"/>
@@ -287,14 +287,14 @@
       <w:pPr>
         <w:spacing w:after="100" w:line="270" w:lineRule="auto"/>
         <w:rPr>
-          <w:rFonts w:ascii="Calibri" w:hAnsi="Calibri"/>
+          <w:rFonts w:ascii="Calibri" w:hAnsi="Calibri" w:cs="Calibri"/>
           <w:color w:val="000000"/>
           <w:sz w:val="22"/>
         </w:rPr>
       </w:pPr>
       <w:r>
         <w:rPr>
-          <w:rFonts w:ascii="Calibri" w:hAnsi="Calibri"/>
+          <w:rFonts w:ascii="Calibri" w:hAnsi="Calibri" w:cs="Calibri"/>
           <w:color w:val="000000"/>
           <w:sz w:val="22"/>
         </w:rPr>
@@ -305,14 +305,14 @@
       <w:pPr>
         <w:spacing w:after="100" w:line="270" w:lineRule="auto"/>
         <w:rPr>
-          <w:rFonts w:ascii="Calibri" w:hAnsi="Calibri"/>
+          <w:rFonts w:ascii="Calibri" w:hAnsi="Calibri" w:cs="Calibri"/>
           <w:color w:val="000000"/>
           <w:sz w:val="22"/>
         </w:rPr>
       </w:pPr>
       <w:r>
         <w:rPr>
-          <w:rFonts w:ascii="Calibri" w:hAnsi="Calibri"/>
+          <w:rFonts w:ascii="Calibri" w:hAnsi="Calibri" w:cs="Calibri"/>
           <w:color w:val="000000"/>
           <w:sz w:val="22"/>
         </w:rPr>
@@ -323,14 +323,14 @@
       <w:pPr>
         <w:spacing w:after="100" w:line="270" w:lineRule="auto"/>
         <w:rPr>
-          <w:rFonts w:ascii="Calibri" w:hAnsi="Calibri"/>
+          <w:rFonts w:ascii="Calibri" w:hAnsi="Calibri" w:cs="Calibri"/>
           <w:color w:val="000000"/>
           <w:sz w:val="22"/>
         </w:rPr>
       </w:pPr>
       <w:r>
         <w:rPr>
-          <w:rFonts w:ascii="Calibri" w:hAnsi="Calibri"/>
+          <w:rFonts w:ascii="Calibri" w:hAnsi="Calibri" w:cs="Calibri"/>
           <w:color w:val="000000"/>
           <w:sz w:val="22"/>
         </w:rPr>
@@ -341,14 +341,14 @@
       <w:pPr>
         <w:spacing w:after="100" w:line="270" w:lineRule="auto"/>
         <w:rPr>
-          <w:rFonts w:ascii="Calibri" w:hAnsi="Calibri"/>
+          <w:rFonts w:ascii="Calibri" w:hAnsi="Calibri" w:cs="Calibri"/>
           <w:color w:val="000000"/>
           <w:sz w:val="22"/>
         </w:rPr>
       </w:pPr>
       <w:r>
         <w:rPr>
-          <w:rFonts w:ascii="Calibri" w:hAnsi="Calibri"/>
+          <w:rFonts w:ascii="Calibri" w:hAnsi="Calibri" w:cs="Calibri"/>
           <w:color w:val="000000"/>
           <w:sz w:val="22"/>
         </w:rPr>
@@ -359,14 +359,14 @@
       <w:pPr>
         <w:spacing w:after="100" w:line="270" w:lineRule="auto"/>
         <w:rPr>
-          <w:rFonts w:ascii="Calibri" w:hAnsi="Calibri"/>
+          <w:rFonts w:ascii="Calibri" w:hAnsi="Calibri" w:cs="Calibri"/>
           <w:color w:val="000000"/>
           <w:sz w:val="22"/>
         </w:rPr>
       </w:pPr>
       <w:r>
         <w:rPr>
-          <w:rFonts w:ascii="Calibri" w:hAnsi="Calibri"/>
+          <w:rFonts w:ascii="Calibri" w:hAnsi="Calibri" w:cs="Calibri"/>
           <w:color w:val="000000"/>
           <w:sz w:val="22"/>
         </w:rPr>
@@ -377,14 +377,14 @@
       <w:pPr>
         <w:spacing w:after="100" w:line="270" w:lineRule="auto"/>
         <w:rPr>
-          <w:rFonts w:ascii="Calibri" w:hAnsi="Calibri"/>
+          <w:rFonts w:ascii="Calibri" w:hAnsi="Calibri" w:cs="Calibri"/>
           <w:color w:val="000000"/>
           <w:sz w:val="22"/>
         </w:rPr>
       </w:pPr>
       <w:r>
         <w:rPr>
-          <w:rFonts w:ascii="Calibri" w:hAnsi="Calibri"/>
+          <w:rFonts w:ascii="Calibri" w:hAnsi="Calibri" w:cs="Calibri"/>
           <w:color w:val="000000"/>
           <w:sz w:val="22"/>
         </w:rPr>
@@ -395,14 +395,14 @@
       <w:pPr>
         <w:spacing w:after="100" w:line="270" w:lineRule="auto"/>
         <w:rPr>
-          <w:rFonts w:ascii="Calibri" w:hAnsi="Calibri"/>
+          <w:rFonts w:ascii="Calibri" w:hAnsi="Calibri" w:cs="Calibri"/>
           <w:color w:val="000000"/>
           <w:sz w:val="22"/>
         </w:rPr>
       </w:pPr>
       <w:r>
         <w:rPr>
-          <w:rFonts w:ascii="Calibri" w:hAnsi="Calibri"/>
+          <w:rFonts w:ascii="Calibri" w:hAnsi="Calibri" w:cs="Calibri"/>
           <w:color w:val="000000"/>
           <w:sz w:val="22"/>
         </w:rPr>
@@ -413,14 +413,14 @@
       <w:pPr>
         <w:spacing w:after="100" w:line="270" w:lineRule="auto"/>
         <w:rPr>
-          <w:rFonts w:ascii="Calibri" w:hAnsi="Calibri"/>
+          <w:rFonts w:ascii="Calibri" w:hAnsi="Calibri" w:cs="Calibri"/>
           <w:color w:val="000000"/>
           <w:sz w:val="22"/>
         </w:rPr>
       </w:pPr>
       <w:r>
         <w:rPr>
-          <w:rFonts w:ascii="Calibri" w:hAnsi="Calibri"/>
+          <w:rFonts w:ascii="Calibri" w:hAnsi="Calibri" w:cs="Calibri"/>
           <w:color w:val="000000"/>
           <w:sz w:val="22"/>
         </w:rPr>
@@ -431,14 +431,14 @@
       <w:pPr>
         <w:spacing w:after="100" w:line="270" w:lineRule="auto"/>
         <w:rPr>
-          <w:rFonts w:ascii="Calibri" w:hAnsi="Calibri"/>
+          <w:rFonts w:ascii="Calibri" w:hAnsi="Calibri" w:cs="Calibri"/>
           <w:color w:val="000000"/>
           <w:sz w:val="22"/>
         </w:rPr>
       </w:pPr>
       <w:r>
         <w:rPr>
-          <w:rFonts w:ascii="Calibri" w:hAnsi="Calibri"/>
+          <w:rFonts w:ascii="Calibri" w:hAnsi="Calibri" w:cs="Calibri"/>
           <w:color w:val="000000"/>
           <w:sz w:val="22"/>
         </w:rPr>
@@ -449,14 +449,14 @@
       <w:pPr>
         <w:spacing w:after="100" w:line="270" w:lineRule="auto"/>
         <w:rPr>
-          <w:rFonts w:ascii="Calibri" w:hAnsi="Calibri"/>
+          <w:rFonts w:ascii="Calibri" w:hAnsi="Calibri" w:cs="Calibri"/>
           <w:color w:val="000000"/>
           <w:sz w:val="22"/>
         </w:rPr>
       </w:pPr>
       <w:r>
         <w:rPr>
-          <w:rFonts w:ascii="Calibri" w:hAnsi="Calibri"/>
+          <w:rFonts w:ascii="Calibri" w:hAnsi="Calibri" w:cs="Calibri"/>
           <w:color w:val="000000"/>
           <w:sz w:val="22"/>
         </w:rPr>
@@ -467,14 +467,14 @@
       <w:pPr>
         <w:spacing w:after="100" w:line="270" w:lineRule="auto"/>
         <w:rPr>
-          <w:rFonts w:ascii="Calibri" w:hAnsi="Calibri"/>
+          <w:rFonts w:ascii="Calibri" w:hAnsi="Calibri" w:cs="Calibri"/>
           <w:color w:val="000000"/>
           <w:sz w:val="22"/>
         </w:rPr>
       </w:pPr>
       <w:r>
         <w:rPr>
-          <w:rFonts w:ascii="Calibri" w:hAnsi="Calibri"/>
+          <w:rFonts w:ascii="Calibri" w:hAnsi="Calibri" w:cs="Calibri"/>
           <w:color w:val="000000"/>
           <w:sz w:val="22"/>
         </w:rPr>
@@ -485,14 +485,14 @@
       <w:pPr>
         <w:spacing w:after="100" w:line="270" w:lineRule="auto"/>
         <w:rPr>
-          <w:rFonts w:ascii="Calibri" w:hAnsi="Calibri"/>
+          <w:rFonts w:ascii="Calibri" w:hAnsi="Calibri" w:cs="Calibri"/>
           <w:color w:val="000000"/>
           <w:sz w:val="22"/>
         </w:rPr>
       </w:pPr>
       <w:r>
         <w:rPr>
-          <w:rFonts w:ascii="Calibri" w:hAnsi="Calibri"/>
+          <w:rFonts w:ascii="Calibri" w:hAnsi="Calibri" w:cs="Calibri"/>
           <w:color w:val="000000"/>
           <w:sz w:val="22"/>
         </w:rPr>
@@ -503,14 +503,14 @@
       <w:pPr>
         <w:spacing w:after="100" w:line="270" w:lineRule="auto"/>
         <w:rPr>
-          <w:rFonts w:ascii="Calibri" w:hAnsi="Calibri"/>
+          <w:rFonts w:ascii="Calibri" w:hAnsi="Calibri" w:cs="Calibri"/>
           <w:color w:val="000000"/>
           <w:sz w:val="22"/>
         </w:rPr>
       </w:pPr>
       <w:r>
         <w:rPr>
-          <w:rFonts w:ascii="Calibri" w:hAnsi="Calibri"/>
+          <w:rFonts w:ascii="Calibri" w:hAnsi="Calibri" w:cs="Calibri"/>
           <w:color w:val="000000"/>
           <w:sz w:val="22"/>
         </w:rPr>
@@ -521,14 +521,14 @@
       <w:pPr>
         <w:spacing w:after="100" w:line="270" w:lineRule="auto"/>
         <w:rPr>
-          <w:rFonts w:ascii="Calibri" w:hAnsi="Calibri"/>
+          <w:rFonts w:ascii="Calibri" w:hAnsi="Calibri" w:cs="Calibri"/>
           <w:color w:val="000000"/>
           <w:sz w:val="22"/>
         </w:rPr>
       </w:pPr>
       <w:r>
         <w:rPr>
-          <w:rFonts w:ascii="Calibri" w:hAnsi="Calibri"/>
+          <w:rFonts w:ascii="Calibri" w:hAnsi="Calibri" w:cs="Calibri"/>
           <w:color w:val="000000"/>
           <w:sz w:val="22"/>
         </w:rPr>
@@ -539,14 +539,14 @@
       <w:pPr>
         <w:spacing w:after="100" w:line="270" w:lineRule="auto"/>
         <w:rPr>
-          <w:rFonts w:ascii="Calibri" w:hAnsi="Calibri"/>
+          <w:rFonts w:ascii="Calibri" w:hAnsi="Calibri" w:cs="Calibri"/>
           <w:color w:val="000000"/>
           <w:sz w:val="22"/>
         </w:rPr>
       </w:pPr>
       <w:r>
         <w:rPr>
-          <w:rFonts w:ascii="Calibri" w:hAnsi="Calibri"/>
+          <w:rFonts w:ascii="Calibri" w:hAnsi="Calibri" w:cs="Calibri"/>
           <w:color w:val="000000"/>
           <w:sz w:val="22"/>
         </w:rPr>
@@ -557,7 +557,7 @@
       <w:pPr>
         <w:spacing w:before="200" w:after="80" w:line="270" w:lineRule="auto"/>
         <w:rPr>
-          <w:rFonts w:ascii="Montserrat" w:hAnsi="Montserrat"/>
+          <w:rFonts w:ascii="Montserrat" w:hAnsi="Montserrat" w:cs="Calibri"/>
           <w:b/>
           <w:color w:val="16302A"/>
           <w:sz w:val="26"/>
@@ -565,7 +565,7 @@
       </w:pPr>
       <w:r>
         <w:rPr>
-          <w:rFonts w:ascii="Montserrat" w:hAnsi="Montserrat"/>
+          <w:rFonts w:ascii="Montserrat" w:hAnsi="Montserrat" w:cs="Calibri"/>
           <w:b/>
           <w:color w:val="16302A"/>
           <w:sz w:val="26"/>
@@ -577,14 +577,14 @@
       <w:pPr>
         <w:spacing w:after="100" w:line="270" w:lineRule="auto"/>
         <w:rPr>
-          <w:rFonts w:ascii="Calibri" w:hAnsi="Calibri"/>
+          <w:rFonts w:ascii="Calibri" w:hAnsi="Calibri" w:cs="Calibri"/>
           <w:color w:val="000000"/>
           <w:sz w:val="22"/>
         </w:rPr>
       </w:pPr>
       <w:r>
         <w:rPr>
-          <w:rFonts w:ascii="Calibri" w:hAnsi="Calibri"/>
+          <w:rFonts w:ascii="Calibri" w:hAnsi="Calibri" w:cs="Calibri"/>
           <w:color w:val="000000"/>
           <w:sz w:val="22"/>
         </w:rPr>
@@ -596,29 +596,29 @@
         <w:spacing w:after="100" w:line="270" w:lineRule="auto"/>
         <w:jc w:val="center"/>
         <w:rPr>
-          <w:rFonts w:ascii="Calibri" w:hAnsi="Calibri"/>
+          <w:rFonts w:ascii="Calibri" w:hAnsi="Calibri" w:cs="Calibri"/>
           <w:color w:val="000000"/>
           <w:sz w:val="22"/>
         </w:rPr>
       </w:pPr>
       <w:r>
         <w:rPr>
-          <w:rFonts w:ascii="Calibri" w:hAnsi="Calibri"/>
+          <w:rFonts w:ascii="Calibri" w:hAnsi="Calibri" w:cs="Calibri"/>
           <w:noProof/>
           <w:color w:val="000000"/>
           <w:sz w:val="22"/>
         </w:rPr>
         <w:drawing>
-          <wp:inline distT="0" distB="0" distL="0" distR="0" wp14:anchorId="594A4611" wp14:editId="3682A0BC">
+          <wp:inline distT="0" distB="0" distL="0" distR="0" wp14:anchorId="7032B68E" wp14:editId="4B80BB2E">
             <wp:extent cx="5842000" cy="4408805"/>
             <wp:effectExtent l="0" t="0" r="6350" b="0"/>
-            <wp:docPr id="114908059" name="Рисунок 1"/>
+            <wp:docPr id="2140692388" name="Рисунок 1"/>
             <wp:cNvGraphicFramePr/>
             <a:graphic xmlns:a="http://schemas.openxmlformats.org/drawingml/2006/main">
               <a:graphicData uri="http://schemas.openxmlformats.org/drawingml/2006/picture">
                 <pic:pic xmlns:pic="http://schemas.openxmlformats.org/drawingml/2006/picture">
                   <pic:nvPicPr>
-                    <pic:cNvPr id="114908059" name=""/>
+                    <pic:cNvPr id="2140692388" name=""/>
                     <pic:cNvPicPr/>
                   </pic:nvPicPr>
                   <pic:blipFill>
@@ -653,7 +653,7 @@
       <w:pPr>
         <w:spacing w:after="100" w:line="270" w:lineRule="auto"/>
         <w:rPr>
-          <w:rFonts w:ascii="Calibri" w:hAnsi="Calibri"/>
+          <w:rFonts w:ascii="Calibri" w:hAnsi="Calibri" w:cs="Calibri"/>
           <w:color w:val="000000"/>
           <w:sz w:val="22"/>
         </w:rPr>
@@ -663,14 +663,14 @@
       <w:pPr>
         <w:spacing w:after="100" w:line="270" w:lineRule="auto"/>
         <w:rPr>
-          <w:rFonts w:ascii="Calibri" w:hAnsi="Calibri"/>
+          <w:rFonts w:ascii="Calibri" w:hAnsi="Calibri" w:cs="Calibri"/>
           <w:color w:val="000000"/>
           <w:sz w:val="22"/>
         </w:rPr>
       </w:pPr>
       <w:r>
         <w:rPr>
-          <w:rFonts w:ascii="Calibri" w:hAnsi="Calibri"/>
+          <w:rFonts w:ascii="Calibri" w:hAnsi="Calibri" w:cs="Calibri"/>
           <w:color w:val="000000"/>
           <w:sz w:val="22"/>
         </w:rPr>
@@ -682,29 +682,29 @@
         <w:spacing w:after="100" w:line="270" w:lineRule="auto"/>
         <w:jc w:val="center"/>
         <w:rPr>
-          <w:rFonts w:ascii="Calibri" w:hAnsi="Calibri"/>
+          <w:rFonts w:ascii="Calibri" w:hAnsi="Calibri" w:cs="Calibri"/>
           <w:color w:val="000000"/>
           <w:sz w:val="22"/>
         </w:rPr>
       </w:pPr>
       <w:r>
         <w:rPr>
-          <w:rFonts w:ascii="Calibri" w:hAnsi="Calibri"/>
+          <w:rFonts w:ascii="Calibri" w:hAnsi="Calibri" w:cs="Calibri"/>
           <w:noProof/>
           <w:color w:val="000000"/>
           <w:sz w:val="22"/>
         </w:rPr>
         <w:drawing>
-          <wp:inline distT="0" distB="0" distL="0" distR="0" wp14:anchorId="36A2F16B" wp14:editId="31A1CB41">
+          <wp:inline distT="0" distB="0" distL="0" distR="0" wp14:anchorId="05C5F498" wp14:editId="3F367A2D">
             <wp:extent cx="2667000" cy="9251950"/>
             <wp:effectExtent l="0" t="0" r="0" b="6350"/>
-            <wp:docPr id="455028657" name="Рисунок 2"/>
+            <wp:docPr id="1019839819" name="Рисунок 2"/>
             <wp:cNvGraphicFramePr/>
             <a:graphic xmlns:a="http://schemas.openxmlformats.org/drawingml/2006/main">
               <a:graphicData uri="http://schemas.openxmlformats.org/drawingml/2006/picture">
                 <pic:pic xmlns:pic="http://schemas.openxmlformats.org/drawingml/2006/picture">
                   <pic:nvPicPr>
-                    <pic:cNvPr id="455028657" name=""/>
+                    <pic:cNvPr id="1019839819" name=""/>
                     <pic:cNvPicPr/>
                   </pic:nvPicPr>
                   <pic:blipFill>
@@ -739,7 +739,7 @@
       <w:pPr>
         <w:spacing w:before="280" w:after="120" w:line="270" w:lineRule="auto"/>
         <w:rPr>
-          <w:rFonts w:ascii="Montserrat" w:hAnsi="Montserrat"/>
+          <w:rFonts w:ascii="Montserrat" w:hAnsi="Montserrat" w:cs="Calibri"/>
           <w:b/>
           <w:color w:val="0F6B5F"/>
           <w:sz w:val="34"/>
@@ -747,7 +747,7 @@
       </w:pPr>
       <w:r>
         <w:rPr>
-          <w:rFonts w:ascii="Montserrat" w:hAnsi="Montserrat"/>
+          <w:rFonts w:ascii="Montserrat" w:hAnsi="Montserrat" w:cs="Calibri"/>
           <w:b/>
           <w:color w:val="0F6B5F"/>
           <w:sz w:val="34"/>
@@ -759,14 +759,14 @@
       <w:pPr>
         <w:spacing w:after="100" w:line="270" w:lineRule="auto"/>
         <w:rPr>
-          <w:rFonts w:ascii="Calibri" w:hAnsi="Calibri"/>
+          <w:rFonts w:ascii="Calibri" w:hAnsi="Calibri" w:cs="Calibri"/>
           <w:color w:val="000000"/>
           <w:sz w:val="22"/>
         </w:rPr>
       </w:pPr>
       <w:r>
         <w:rPr>
-          <w:rFonts w:ascii="Calibri" w:hAnsi="Calibri"/>
+          <w:rFonts w:ascii="Calibri" w:hAnsi="Calibri" w:cs="Calibri"/>
           <w:color w:val="000000"/>
           <w:sz w:val="22"/>
         </w:rPr>
@@ -777,14 +777,14 @@
       <w:pPr>
         <w:spacing w:after="100" w:line="270" w:lineRule="auto"/>
         <w:rPr>
-          <w:rFonts w:ascii="Calibri" w:hAnsi="Calibri"/>
+          <w:rFonts w:ascii="Calibri" w:hAnsi="Calibri" w:cs="Calibri"/>
           <w:color w:val="000000"/>
           <w:sz w:val="22"/>
         </w:rPr>
       </w:pPr>
       <w:r>
         <w:rPr>
-          <w:rFonts w:ascii="Calibri" w:hAnsi="Calibri"/>
+          <w:rFonts w:ascii="Calibri" w:hAnsi="Calibri" w:cs="Calibri"/>
           <w:color w:val="000000"/>
           <w:sz w:val="22"/>
         </w:rPr>
@@ -795,14 +795,14 @@
       <w:pPr>
         <w:spacing w:after="100" w:line="270" w:lineRule="auto"/>
         <w:rPr>
-          <w:rFonts w:ascii="Calibri" w:hAnsi="Calibri"/>
+          <w:rFonts w:ascii="Calibri" w:hAnsi="Calibri" w:cs="Calibri"/>
           <w:color w:val="000000"/>
           <w:sz w:val="22"/>
         </w:rPr>
       </w:pPr>
       <w:r>
         <w:rPr>
-          <w:rFonts w:ascii="Calibri" w:hAnsi="Calibri"/>
+          <w:rFonts w:ascii="Calibri" w:hAnsi="Calibri" w:cs="Calibri"/>
           <w:color w:val="000000"/>
           <w:sz w:val="22"/>
         </w:rPr>
@@ -813,14 +813,14 @@
       <w:pPr>
         <w:spacing w:after="100" w:line="270" w:lineRule="auto"/>
         <w:rPr>
-          <w:rFonts w:ascii="Calibri" w:hAnsi="Calibri"/>
+          <w:rFonts w:ascii="Calibri" w:hAnsi="Calibri" w:cs="Calibri"/>
           <w:color w:val="000000"/>
           <w:sz w:val="22"/>
         </w:rPr>
       </w:pPr>
       <w:r>
         <w:rPr>
-          <w:rFonts w:ascii="Calibri" w:hAnsi="Calibri"/>
+          <w:rFonts w:ascii="Calibri" w:hAnsi="Calibri" w:cs="Calibri"/>
           <w:color w:val="000000"/>
           <w:sz w:val="22"/>
         </w:rPr>
@@ -831,14 +831,14 @@
       <w:pPr>
         <w:spacing w:after="100" w:line="270" w:lineRule="auto"/>
         <w:rPr>
-          <w:rFonts w:ascii="Calibri" w:hAnsi="Calibri"/>
+          <w:rFonts w:ascii="Calibri" w:hAnsi="Calibri" w:cs="Calibri"/>
           <w:color w:val="000000"/>
           <w:sz w:val="22"/>
         </w:rPr>
       </w:pPr>
       <w:r>
         <w:rPr>
-          <w:rFonts w:ascii="Calibri" w:hAnsi="Calibri"/>
+          <w:rFonts w:ascii="Calibri" w:hAnsi="Calibri" w:cs="Calibri"/>
           <w:color w:val="000000"/>
           <w:sz w:val="22"/>
         </w:rPr>
@@ -849,7 +849,7 @@
       <w:pPr>
         <w:spacing w:before="200" w:after="80" w:line="270" w:lineRule="auto"/>
         <w:rPr>
-          <w:rFonts w:ascii="Montserrat" w:hAnsi="Montserrat"/>
+          <w:rFonts w:ascii="Montserrat" w:hAnsi="Montserrat" w:cs="Calibri"/>
           <w:b/>
           <w:color w:val="16302A"/>
           <w:sz w:val="26"/>
@@ -857,7 +857,7 @@
       </w:pPr>
       <w:r>
         <w:rPr>
-          <w:rFonts w:ascii="Montserrat" w:hAnsi="Montserrat"/>
+          <w:rFonts w:ascii="Montserrat" w:hAnsi="Montserrat" w:cs="Calibri"/>
           <w:b/>
           <w:color w:val="16302A"/>
           <w:sz w:val="26"/>
@@ -3110,7 +3110,7 @@
       <w:pPr>
         <w:spacing w:before="200" w:after="80" w:line="270" w:lineRule="auto"/>
         <w:rPr>
-          <w:rFonts w:ascii="Montserrat" w:hAnsi="Montserrat"/>
+          <w:rFonts w:ascii="Montserrat" w:hAnsi="Montserrat" w:cs="Calibri"/>
           <w:b/>
           <w:color w:val="16302A"/>
           <w:sz w:val="26"/>
@@ -3163,16 +3163,16 @@
           <w:sz w:val="22"/>
         </w:rPr>
         <w:drawing>
-          <wp:inline distT="0" distB="0" distL="0" distR="0" wp14:anchorId="0190D01E" wp14:editId="39C5DD39">
+          <wp:inline distT="0" distB="0" distL="0" distR="0" wp14:anchorId="49434247" wp14:editId="338E9056">
             <wp:extent cx="5842000" cy="5568950"/>
             <wp:effectExtent l="0" t="0" r="6350" b="0"/>
-            <wp:docPr id="1961083193" name="Рисунок 3"/>
+            <wp:docPr id="904297324" name="Рисунок 3"/>
             <wp:cNvGraphicFramePr/>
             <a:graphic xmlns:a="http://schemas.openxmlformats.org/drawingml/2006/main">
               <a:graphicData uri="http://schemas.openxmlformats.org/drawingml/2006/picture">
                 <pic:pic xmlns:pic="http://schemas.openxmlformats.org/drawingml/2006/picture">
                   <pic:nvPicPr>
-                    <pic:cNvPr id="1961083193" name=""/>
+                    <pic:cNvPr id="904297324" name=""/>
                     <pic:cNvPicPr/>
                   </pic:nvPicPr>
                   <pic:blipFill>
@@ -4951,16 +4951,16 @@
           <w:sz w:val="22"/>
         </w:rPr>
         <w:drawing>
-          <wp:inline distT="0" distB="0" distL="0" distR="0" wp14:anchorId="6C9E76B1" wp14:editId="72133154">
+          <wp:inline distT="0" distB="0" distL="0" distR="0" wp14:anchorId="17DA27BE" wp14:editId="64C27978">
             <wp:extent cx="5842000" cy="5568950"/>
             <wp:effectExtent l="0" t="0" r="6350" b="0"/>
-            <wp:docPr id="1879501213" name="Рисунок 4"/>
+            <wp:docPr id="49325926" name="Рисунок 4"/>
             <wp:cNvGraphicFramePr/>
             <a:graphic xmlns:a="http://schemas.openxmlformats.org/drawingml/2006/main">
               <a:graphicData uri="http://schemas.openxmlformats.org/drawingml/2006/picture">
                 <pic:pic xmlns:pic="http://schemas.openxmlformats.org/drawingml/2006/picture">
                   <pic:nvPicPr>
-                    <pic:cNvPr id="1879501213" name=""/>
+                    <pic:cNvPr id="49325926" name=""/>
                     <pic:cNvPicPr/>
                   </pic:nvPicPr>
                   <pic:blipFill>
@@ -5626,7 +5626,7 @@
     <w:link w:val="10"/>
     <w:uiPriority w:val="9"/>
     <w:qFormat/>
-    <w:rsid w:val="00A64E68"/>
+    <w:rsid w:val="00E62BAC"/>
     <w:pPr>
       <w:keepNext/>
       <w:keepLines/>
@@ -5635,7 +5635,7 @@
     </w:pPr>
     <w:rPr>
       <w:rFonts w:asciiTheme="majorHAnsi" w:eastAsiaTheme="majorEastAsia" w:hAnsiTheme="majorHAnsi" w:cstheme="majorBidi"/>
-      <w:color w:val="0F4761" w:themeColor="accent1" w:themeShade="BF"/>
+      <w:color w:val="2F5496" w:themeColor="accent1" w:themeShade="BF"/>
       <w:sz w:val="40"/>
       <w:szCs w:val="40"/>
     </w:rPr>
@@ -5649,7 +5649,7 @@
     <w:semiHidden/>
     <w:unhideWhenUsed/>
     <w:qFormat/>
-    <w:rsid w:val="00A64E68"/>
+    <w:rsid w:val="00E62BAC"/>
     <w:pPr>
       <w:keepNext/>
       <w:keepLines/>
@@ -5658,7 +5658,7 @@
     </w:pPr>
     <w:rPr>
       <w:rFonts w:asciiTheme="majorHAnsi" w:eastAsiaTheme="majorEastAsia" w:hAnsiTheme="majorHAnsi" w:cstheme="majorBidi"/>
-      <w:color w:val="0F4761" w:themeColor="accent1" w:themeShade="BF"/>
+      <w:color w:val="2F5496" w:themeColor="accent1" w:themeShade="BF"/>
       <w:sz w:val="32"/>
       <w:szCs w:val="32"/>
     </w:rPr>
@@ -5672,7 +5672,7 @@
     <w:semiHidden/>
     <w:unhideWhenUsed/>
     <w:qFormat/>
-    <w:rsid w:val="00A64E68"/>
+    <w:rsid w:val="00E62BAC"/>
     <w:pPr>
       <w:keepNext/>
       <w:keepLines/>
@@ -5681,7 +5681,7 @@
     </w:pPr>
     <w:rPr>
       <w:rFonts w:eastAsiaTheme="majorEastAsia" w:cstheme="majorBidi"/>
-      <w:color w:val="0F4761" w:themeColor="accent1" w:themeShade="BF"/>
+      <w:color w:val="2F5496" w:themeColor="accent1" w:themeShade="BF"/>
       <w:sz w:val="28"/>
       <w:szCs w:val="28"/>
     </w:rPr>
@@ -5695,7 +5695,7 @@
     <w:semiHidden/>
     <w:unhideWhenUsed/>
     <w:qFormat/>
-    <w:rsid w:val="00A64E68"/>
+    <w:rsid w:val="00E62BAC"/>
     <w:pPr>
       <w:keepNext/>
       <w:keepLines/>
@@ -5706,7 +5706,7 @@
       <w:rFonts w:eastAsiaTheme="majorEastAsia" w:cstheme="majorBidi"/>
       <w:i/>
       <w:iCs/>
-      <w:color w:val="0F4761" w:themeColor="accent1" w:themeShade="BF"/>
+      <w:color w:val="2F5496" w:themeColor="accent1" w:themeShade="BF"/>
     </w:rPr>
   </w:style>
   <w:style w:type="paragraph" w:styleId="5">
@@ -5718,7 +5718,7 @@
     <w:semiHidden/>
     <w:unhideWhenUsed/>
     <w:qFormat/>
-    <w:rsid w:val="00A64E68"/>
+    <w:rsid w:val="00E62BAC"/>
     <w:pPr>
       <w:keepNext/>
       <w:keepLines/>
@@ -5727,7 +5727,7 @@
     </w:pPr>
     <w:rPr>
       <w:rFonts w:eastAsiaTheme="majorEastAsia" w:cstheme="majorBidi"/>
-      <w:color w:val="0F4761" w:themeColor="accent1" w:themeShade="BF"/>
+      <w:color w:val="2F5496" w:themeColor="accent1" w:themeShade="BF"/>
     </w:rPr>
   </w:style>
   <w:style w:type="paragraph" w:styleId="6">
@@ -5739,7 +5739,7 @@
     <w:semiHidden/>
     <w:unhideWhenUsed/>
     <w:qFormat/>
-    <w:rsid w:val="00A64E68"/>
+    <w:rsid w:val="00E62BAC"/>
     <w:pPr>
       <w:keepNext/>
       <w:keepLines/>
@@ -5762,7 +5762,7 @@
     <w:semiHidden/>
     <w:unhideWhenUsed/>
     <w:qFormat/>
-    <w:rsid w:val="00A64E68"/>
+    <w:rsid w:val="00E62BAC"/>
     <w:pPr>
       <w:keepNext/>
       <w:keepLines/>
@@ -5783,7 +5783,7 @@
     <w:semiHidden/>
     <w:unhideWhenUsed/>
     <w:qFormat/>
-    <w:rsid w:val="00A64E68"/>
+    <w:rsid w:val="00E62BAC"/>
     <w:pPr>
       <w:keepNext/>
       <w:keepLines/>
@@ -5806,7 +5806,7 @@
     <w:semiHidden/>
     <w:unhideWhenUsed/>
     <w:qFormat/>
-    <w:rsid w:val="00A64E68"/>
+    <w:rsid w:val="00E62BAC"/>
     <w:pPr>
       <w:keepNext/>
       <w:keepLines/>
@@ -5850,10 +5850,10 @@
     <w:basedOn w:val="a0"/>
     <w:link w:val="1"/>
     <w:uiPriority w:val="9"/>
-    <w:rsid w:val="00A64E68"/>
+    <w:rsid w:val="00E62BAC"/>
     <w:rPr>
       <w:rFonts w:asciiTheme="majorHAnsi" w:eastAsiaTheme="majorEastAsia" w:hAnsiTheme="majorHAnsi" w:cstheme="majorBidi"/>
-      <w:color w:val="0F4761" w:themeColor="accent1" w:themeShade="BF"/>
+      <w:color w:val="2F5496" w:themeColor="accent1" w:themeShade="BF"/>
       <w:sz w:val="40"/>
       <w:szCs w:val="40"/>
     </w:rPr>
@@ -5864,10 +5864,10 @@
     <w:link w:val="2"/>
     <w:uiPriority w:val="9"/>
     <w:semiHidden/>
-    <w:rsid w:val="00A64E68"/>
+    <w:rsid w:val="00E62BAC"/>
     <w:rPr>
       <w:rFonts w:asciiTheme="majorHAnsi" w:eastAsiaTheme="majorEastAsia" w:hAnsiTheme="majorHAnsi" w:cstheme="majorBidi"/>
-      <w:color w:val="0F4761" w:themeColor="accent1" w:themeShade="BF"/>
+      <w:color w:val="2F5496" w:themeColor="accent1" w:themeShade="BF"/>
       <w:sz w:val="32"/>
       <w:szCs w:val="32"/>
     </w:rPr>
@@ -5878,10 +5878,10 @@
     <w:link w:val="3"/>
     <w:uiPriority w:val="9"/>
     <w:semiHidden/>
-    <w:rsid w:val="00A64E68"/>
+    <w:rsid w:val="00E62BAC"/>
     <w:rPr>
       <w:rFonts w:eastAsiaTheme="majorEastAsia" w:cstheme="majorBidi"/>
-      <w:color w:val="0F4761" w:themeColor="accent1" w:themeShade="BF"/>
+      <w:color w:val="2F5496" w:themeColor="accent1" w:themeShade="BF"/>
       <w:sz w:val="28"/>
       <w:szCs w:val="28"/>
     </w:rPr>
@@ -5892,12 +5892,12 @@
     <w:link w:val="4"/>
     <w:uiPriority w:val="9"/>
     <w:semiHidden/>
-    <w:rsid w:val="00A64E68"/>
+    <w:rsid w:val="00E62BAC"/>
     <w:rPr>
       <w:rFonts w:eastAsiaTheme="majorEastAsia" w:cstheme="majorBidi"/>
       <w:i/>
       <w:iCs/>
-      <w:color w:val="0F4761" w:themeColor="accent1" w:themeShade="BF"/>
+      <w:color w:val="2F5496" w:themeColor="accent1" w:themeShade="BF"/>
     </w:rPr>
   </w:style>
   <w:style w:type="character" w:customStyle="1" w:styleId="50">
@@ -5906,10 +5906,10 @@
     <w:link w:val="5"/>
     <w:uiPriority w:val="9"/>
     <w:semiHidden/>
-    <w:rsid w:val="00A64E68"/>
+    <w:rsid w:val="00E62BAC"/>
     <w:rPr>
       <w:rFonts w:eastAsiaTheme="majorEastAsia" w:cstheme="majorBidi"/>
-      <w:color w:val="0F4761" w:themeColor="accent1" w:themeShade="BF"/>
+      <w:color w:val="2F5496" w:themeColor="accent1" w:themeShade="BF"/>
     </w:rPr>
   </w:style>
   <w:style w:type="character" w:customStyle="1" w:styleId="60">
@@ -5918,7 +5918,7 @@
     <w:link w:val="6"/>
     <w:uiPriority w:val="9"/>
     <w:semiHidden/>
-    <w:rsid w:val="00A64E68"/>
+    <w:rsid w:val="00E62BAC"/>
     <w:rPr>
       <w:rFonts w:eastAsiaTheme="majorEastAsia" w:cstheme="majorBidi"/>
       <w:i/>
@@ -5932,7 +5932,7 @@
     <w:link w:val="7"/>
     <w:uiPriority w:val="9"/>
     <w:semiHidden/>
-    <w:rsid w:val="00A64E68"/>
+    <w:rsid w:val="00E62BAC"/>
     <w:rPr>
       <w:rFonts w:eastAsiaTheme="majorEastAsia" w:cstheme="majorBidi"/>
       <w:color w:val="595959" w:themeColor="text1" w:themeTint="A6"/>
@@ -5944,7 +5944,7 @@
     <w:link w:val="8"/>
     <w:uiPriority w:val="9"/>
     <w:semiHidden/>
-    <w:rsid w:val="00A64E68"/>
+    <w:rsid w:val="00E62BAC"/>
     <w:rPr>
       <w:rFonts w:eastAsiaTheme="majorEastAsia" w:cstheme="majorBidi"/>
       <w:i/>
@@ -5958,7 +5958,7 @@
     <w:link w:val="9"/>
     <w:uiPriority w:val="9"/>
     <w:semiHidden/>
-    <w:rsid w:val="00A64E68"/>
+    <w:rsid w:val="00E62BAC"/>
     <w:rPr>
       <w:rFonts w:eastAsiaTheme="majorEastAsia" w:cstheme="majorBidi"/>
       <w:color w:val="272727" w:themeColor="text1" w:themeTint="D8"/>
@@ -5971,7 +5971,7 @@
     <w:link w:val="a4"/>
     <w:uiPriority w:val="10"/>
     <w:qFormat/>
-    <w:rsid w:val="00A64E68"/>
+    <w:rsid w:val="00E62BAC"/>
     <w:pPr>
       <w:spacing w:after="80" w:line="240" w:lineRule="auto"/>
       <w:contextualSpacing/>
@@ -5989,7 +5989,7 @@
     <w:basedOn w:val="a0"/>
     <w:link w:val="a3"/>
     <w:uiPriority w:val="10"/>
-    <w:rsid w:val="00A64E68"/>
+    <w:rsid w:val="00E62BAC"/>
     <w:rPr>
       <w:rFonts w:asciiTheme="majorHAnsi" w:eastAsiaTheme="majorEastAsia" w:hAnsiTheme="majorHAnsi" w:cstheme="majorBidi"/>
       <w:spacing w:val="-10"/>
@@ -6005,7 +6005,7 @@
     <w:link w:val="a6"/>
     <w:uiPriority w:val="11"/>
     <w:qFormat/>
-    <w:rsid w:val="00A64E68"/>
+    <w:rsid w:val="00E62BAC"/>
     <w:pPr>
       <w:numPr>
         <w:ilvl w:val="1"/>
@@ -6024,7 +6024,7 @@
     <w:basedOn w:val="a0"/>
     <w:link w:val="a5"/>
     <w:uiPriority w:val="11"/>
-    <w:rsid w:val="00A64E68"/>
+    <w:rsid w:val="00E62BAC"/>
     <w:rPr>
       <w:rFonts w:eastAsiaTheme="majorEastAsia" w:cstheme="majorBidi"/>
       <w:color w:val="595959" w:themeColor="text1" w:themeTint="A6"/>
@@ -6040,7 +6040,7 @@
     <w:link w:val="22"/>
     <w:uiPriority w:val="29"/>
     <w:qFormat/>
-    <w:rsid w:val="00A64E68"/>
+    <w:rsid w:val="00E62BAC"/>
     <w:pPr>
       <w:spacing w:before="160"/>
       <w:jc w:val="center"/>
@@ -6056,7 +6056,7 @@
     <w:basedOn w:val="a0"/>
     <w:link w:val="21"/>
     <w:uiPriority w:val="29"/>
-    <w:rsid w:val="00A64E68"/>
+    <w:rsid w:val="00E62BAC"/>
     <w:rPr>
       <w:i/>
       <w:iCs/>
@@ -6068,7 +6068,7 @@
     <w:basedOn w:val="a"/>
     <w:uiPriority w:val="34"/>
     <w:qFormat/>
-    <w:rsid w:val="00A64E68"/>
+    <w:rsid w:val="00E62BAC"/>
     <w:pPr>
       <w:ind w:left="720"/>
       <w:contextualSpacing/>
@@ -6079,11 +6079,11 @@
     <w:basedOn w:val="a0"/>
     <w:uiPriority w:val="21"/>
     <w:qFormat/>
-    <w:rsid w:val="00A64E68"/>
+    <w:rsid w:val="00E62BAC"/>
     <w:rPr>
       <w:i/>
       <w:iCs/>
-      <w:color w:val="0F4761" w:themeColor="accent1" w:themeShade="BF"/>
+      <w:color w:val="2F5496" w:themeColor="accent1" w:themeShade="BF"/>
     </w:rPr>
   </w:style>
   <w:style w:type="paragraph" w:styleId="a9">
@@ -6093,11 +6093,11 @@
     <w:link w:val="aa"/>
     <w:uiPriority w:val="30"/>
     <w:qFormat/>
-    <w:rsid w:val="00A64E68"/>
+    <w:rsid w:val="00E62BAC"/>
     <w:pPr>
       <w:pBdr>
-        <w:top w:val="single" w:sz="4" w:space="10" w:color="0F4761" w:themeColor="accent1" w:themeShade="BF"/>
-        <w:bottom w:val="single" w:sz="4" w:space="10" w:color="0F4761" w:themeColor="accent1" w:themeShade="BF"/>
+        <w:top w:val="single" w:sz="4" w:space="10" w:color="2F5496" w:themeColor="accent1" w:themeShade="BF"/>
+        <w:bottom w:val="single" w:sz="4" w:space="10" w:color="2F5496" w:themeColor="accent1" w:themeShade="BF"/>
       </w:pBdr>
       <w:spacing w:before="360" w:after="360"/>
       <w:ind w:left="864" w:right="864"/>
@@ -6106,7 +6106,7 @@
     <w:rPr>
       <w:i/>
       <w:iCs/>
-      <w:color w:val="0F4761" w:themeColor="accent1" w:themeShade="BF"/>
+      <w:color w:val="2F5496" w:themeColor="accent1" w:themeShade="BF"/>
     </w:rPr>
   </w:style>
   <w:style w:type="character" w:customStyle="1" w:styleId="aa">
@@ -6114,11 +6114,11 @@
     <w:basedOn w:val="a0"/>
     <w:link w:val="a9"/>
     <w:uiPriority w:val="30"/>
-    <w:rsid w:val="00A64E68"/>
+    <w:rsid w:val="00E62BAC"/>
     <w:rPr>
       <w:i/>
       <w:iCs/>
-      <w:color w:val="0F4761" w:themeColor="accent1" w:themeShade="BF"/>
+      <w:color w:val="2F5496" w:themeColor="accent1" w:themeShade="BF"/>
     </w:rPr>
   </w:style>
   <w:style w:type="character" w:styleId="ab">
@@ -6126,12 +6126,12 @@
     <w:basedOn w:val="a0"/>
     <w:uiPriority w:val="32"/>
     <w:qFormat/>
-    <w:rsid w:val="00A64E68"/>
+    <w:rsid w:val="00E62BAC"/>
     <w:rPr>
       <w:b/>
       <w:bCs/>
       <w:smallCaps/>
-      <w:color w:val="0F4761" w:themeColor="accent1" w:themeShade="BF"/>
+      <w:color w:val="2F5496" w:themeColor="accent1" w:themeShade="BF"/>
       <w:spacing w:val="5"/>
     </w:rPr>
   </w:style>
@@ -6149,39 +6149,39 @@
         <a:sysClr val="window" lastClr="FFFFFF"/>
       </a:lt1>
       <a:dk2>
-        <a:srgbClr val="0E2841"/>
+        <a:srgbClr val="44546A"/>
       </a:dk2>
       <a:lt2>
-        <a:srgbClr val="E8E8E8"/>
+        <a:srgbClr val="E7E6E6"/>
       </a:lt2>
       <a:accent1>
-        <a:srgbClr val="156082"/>
+        <a:srgbClr val="4472C4"/>
       </a:accent1>
       <a:accent2>
-        <a:srgbClr val="E97132"/>
+        <a:srgbClr val="ED7D31"/>
       </a:accent2>
       <a:accent3>
-        <a:srgbClr val="196B24"/>
+        <a:srgbClr val="A5A5A5"/>
       </a:accent3>
       <a:accent4>
-        <a:srgbClr val="0F9ED5"/>
+        <a:srgbClr val="FFC000"/>
       </a:accent4>
       <a:accent5>
-        <a:srgbClr val="A02B93"/>
+        <a:srgbClr val="5B9BD5"/>
       </a:accent5>
       <a:accent6>
-        <a:srgbClr val="4EA72E"/>
+        <a:srgbClr val="70AD47"/>
       </a:accent6>
       <a:hlink>
-        <a:srgbClr val="467886"/>
+        <a:srgbClr val="0563C1"/>
       </a:hlink>
       <a:folHlink>
-        <a:srgbClr val="96607D"/>
+        <a:srgbClr val="954F72"/>
       </a:folHlink>
     </a:clrScheme>
     <a:fontScheme name="Стандартная">
       <a:majorFont>
-        <a:latin typeface="Aptos Display" panose="02110004020202020204"/>
+        <a:latin typeface="Calibri Light" panose="020F0302020204030204"/>
         <a:ea typeface=""/>
         <a:cs typeface=""/>
         <a:font script="Jpan" typeface="游ゴシック Light"/>
@@ -6233,7 +6233,7 @@
         <a:font script="Tfng" typeface="Ebrima"/>
       </a:majorFont>
       <a:minorFont>
-        <a:latin typeface="Aptos" panose="02110004020202020204"/>
+        <a:latin typeface="Calibri" panose="020F0502020204030204"/>
         <a:ea typeface=""/>
         <a:cs typeface=""/>
         <a:font script="Jpan" typeface="游明朝"/>
@@ -6344,6 +6344,13 @@
         </a:gradFill>
       </a:fillStyleLst>
       <a:lnStyleLst>
+        <a:ln w="6350" cap="flat" cmpd="sng" algn="ctr">
+          <a:solidFill>
+            <a:schemeClr val="phClr"/>
+          </a:solidFill>
+          <a:prstDash val="solid"/>
+          <a:miter lim="800000"/>
+        </a:ln>
         <a:ln w="12700" cap="flat" cmpd="sng" algn="ctr">
           <a:solidFill>
             <a:schemeClr val="phClr"/>
@@ -6352,13 +6359,6 @@
           <a:miter lim="800000"/>
         </a:ln>
         <a:ln w="19050" cap="flat" cmpd="sng" algn="ctr">
-          <a:solidFill>
-            <a:schemeClr val="phClr"/>
-          </a:solidFill>
-          <a:prstDash val="solid"/>
-          <a:miter lim="800000"/>
-        </a:ln>
-        <a:ln w="25400" cap="flat" cmpd="sng" algn="ctr">
           <a:solidFill>
             <a:schemeClr val="phClr"/>
           </a:solidFill>
@@ -6423,31 +6423,11 @@
       </a:bgFillStyleLst>
     </a:fmtScheme>
   </a:themeElements>
-  <a:objectDefaults>
-    <a:lnDef>
-      <a:spPr/>
-      <a:bodyPr/>
-      <a:lstStyle/>
-      <a:style>
-        <a:lnRef idx="2">
-          <a:schemeClr val="accent1"/>
-        </a:lnRef>
-        <a:fillRef idx="0">
-          <a:schemeClr val="accent1"/>
-        </a:fillRef>
-        <a:effectRef idx="1">
-          <a:schemeClr val="accent1"/>
-        </a:effectRef>
-        <a:fontRef idx="minor">
-          <a:schemeClr val="tx1"/>
-        </a:fontRef>
-      </a:style>
-    </a:lnDef>
-  </a:objectDefaults>
+  <a:objectDefaults/>
   <a:extraClrSchemeLst/>
   <a:extLst>
     <a:ext uri="{05A4C25C-085E-4340-85A3-A5531E510DB2}">
-      <thm15:themeFamily xmlns:thm15="http://schemas.microsoft.com/office/thememl/2012/main" name="Office Theme" id="{2E142A2C-CD16-42D6-873A-C26D2A0506FA}" vid="{1BDDFF52-6CD6-40A5-AB3C-68EB2F1E4D0A}"/>
+      <thm15:themeFamily xmlns:thm15="http://schemas.microsoft.com/office/thememl/2012/main" name="Office Theme" id="{62F939B6-93AF-4DB8-9C6B-D6C7DFDC589F}" vid="{4A3C46E8-61CC-4603-A589-7422A47A8E4A}"/>
     </a:ext>
   </a:extLst>
 </a:theme>

</xml_diff>